<commit_message>
Update testing report with screenshots
</commit_message>
<xml_diff>
--- a/docs/USB_Device_Control_Monitoring_Test_Report.docx
+++ b/docs/USB_Device_Control_Monitoring_Test_Report.docx
@@ -159,8 +159,15 @@
       <w:pPr>
         <w:pStyle w:val="ListBullet"/>
       </w:pPr>
+      <w:proofErr w:type="spellStart"/>
+      <w:proofErr w:type="gramStart"/>
       <w:r>
-        <w:t>config.json — project settings; automatic blocking remained disabled during tests.</w:t>
+        <w:t>config.json</w:t>
+      </w:r>
+      <w:proofErr w:type="spellEnd"/>
+      <w:proofErr w:type="gramEnd"/>
+      <w:r>
+        <w:t xml:space="preserve"> — project settings; automatic blocking remained disabled during tests.</w:t>
       </w:r>
     </w:p>
     <w:p>
@@ -168,7 +175,76 @@
         <w:pStyle w:val="ListBullet"/>
       </w:pPr>
       <w:r>
-        <w:t>logs/usb_events.jsonl — USB events; logs/file_audit_test.jsonl — isolated audit test.</w:t>
+        <w:rPr>
+          <w:noProof/>
+        </w:rPr>
+        <w:drawing>
+          <wp:anchor distT="0" distB="0" distL="114300" distR="114300" simplePos="0" relativeHeight="251662336" behindDoc="0" locked="0" layoutInCell="1" allowOverlap="1" wp14:anchorId="5B182CA1" wp14:editId="44FB13D2">
+            <wp:simplePos x="0" y="0"/>
+            <wp:positionH relativeFrom="margin">
+              <wp:align>left</wp:align>
+            </wp:positionH>
+            <wp:positionV relativeFrom="page">
+              <wp:posOffset>6442287</wp:posOffset>
+            </wp:positionV>
+            <wp:extent cx="6309360" cy="3238500"/>
+            <wp:effectExtent l="0" t="0" r="0" b="0"/>
+            <wp:wrapTopAndBottom/>
+            <wp:docPr id="79076446" name="Picture 7"/>
+            <wp:cNvGraphicFramePr>
+              <a:graphicFrameLocks xmlns:a="http://schemas.openxmlformats.org/drawingml/2006/main" noChangeAspect="1"/>
+            </wp:cNvGraphicFramePr>
+            <a:graphic xmlns:a="http://schemas.openxmlformats.org/drawingml/2006/main">
+              <a:graphicData uri="http://schemas.openxmlformats.org/drawingml/2006/picture">
+                <pic:pic xmlns:pic="http://schemas.openxmlformats.org/drawingml/2006/picture">
+                  <pic:nvPicPr>
+                    <pic:cNvPr id="0" name="Picture 17"/>
+                    <pic:cNvPicPr>
+                      <a:picLocks noChangeAspect="1" noChangeArrowheads="1"/>
+                    </pic:cNvPicPr>
+                  </pic:nvPicPr>
+                  <pic:blipFill>
+                    <a:blip r:embed="rId8">
+                      <a:extLst>
+                        <a:ext uri="{28A0092B-C50C-407E-A947-70E740481C1C}">
+                          <a14:useLocalDpi xmlns:a14="http://schemas.microsoft.com/office/drawing/2010/main" val="0"/>
+                        </a:ext>
+                      </a:extLst>
+                    </a:blip>
+                    <a:srcRect/>
+                    <a:stretch>
+                      <a:fillRect/>
+                    </a:stretch>
+                  </pic:blipFill>
+                  <pic:spPr bwMode="auto">
+                    <a:xfrm>
+                      <a:off x="0" y="0"/>
+                      <a:ext cx="6309360" cy="3238500"/>
+                    </a:xfrm>
+                    <a:prstGeom prst="rect">
+                      <a:avLst/>
+                    </a:prstGeom>
+                    <a:noFill/>
+                    <a:ln>
+                      <a:noFill/>
+                    </a:ln>
+                  </pic:spPr>
+                </pic:pic>
+              </a:graphicData>
+            </a:graphic>
+          </wp:anchor>
+        </w:drawing>
+      </w:r>
+      <w:r>
+        <w:t>logs/</w:t>
+      </w:r>
+      <w:proofErr w:type="spellStart"/>
+      <w:r>
+        <w:t>usb_events.jsonl</w:t>
+      </w:r>
+      <w:proofErr w:type="spellEnd"/>
+      <w:r>
+        <w:t xml:space="preserve"> — USB events; logs/file_audit_test.jsonl — isolated audit test.</w:t>
       </w:r>
     </w:p>
     <w:p>
@@ -176,30 +252,32 @@
         <w:pStyle w:val="Heading1"/>
       </w:pPr>
       <w:r>
+        <w:lastRenderedPageBreak/>
         <w:t>4. Test Results</w:t>
       </w:r>
     </w:p>
     <w:tbl>
       <w:tblPr>
         <w:tblStyle w:val="LightShading-Accent1"/>
-        <w:tblW w:w="0" w:type="auto"/>
+        <w:tblW w:w="9987" w:type="dxa"/>
         <w:jc w:val="center"/>
         <w:tblLook w:val="04A0" w:firstRow="1" w:lastRow="0" w:firstColumn="1" w:lastColumn="0" w:noHBand="0" w:noVBand="1"/>
       </w:tblPr>
       <w:tblGrid>
-        <w:gridCol w:w="3312"/>
-        <w:gridCol w:w="3312"/>
-        <w:gridCol w:w="3312"/>
+        <w:gridCol w:w="3329"/>
+        <w:gridCol w:w="3329"/>
+        <w:gridCol w:w="3329"/>
       </w:tblGrid>
       <w:tr>
         <w:trPr>
           <w:cnfStyle w:val="100000000000" w:firstRow="1" w:lastRow="0" w:firstColumn="0" w:lastColumn="0" w:oddVBand="0" w:evenVBand="0" w:oddHBand="0" w:evenHBand="0" w:firstRowFirstColumn="0" w:firstRowLastColumn="0" w:lastRowFirstColumn="0" w:lastRowLastColumn="0"/>
+          <w:trHeight w:val="641"/>
           <w:jc w:val="center"/>
         </w:trPr>
         <w:tc>
           <w:tcPr>
             <w:cnfStyle w:val="001000000000" w:firstRow="0" w:lastRow="0" w:firstColumn="1" w:lastColumn="0" w:oddVBand="0" w:evenVBand="0" w:oddHBand="0" w:evenHBand="0" w:firstRowFirstColumn="0" w:firstRowLastColumn="0" w:lastRowFirstColumn="0" w:lastRowLastColumn="0"/>
-            <w:tcW w:w="3312" w:type="dxa"/>
+            <w:tcW w:w="3329" w:type="dxa"/>
           </w:tcPr>
           <w:p>
             <w:r>
@@ -209,7 +287,7 @@
         </w:tc>
         <w:tc>
           <w:tcPr>
-            <w:tcW w:w="3312" w:type="dxa"/>
+            <w:tcW w:w="3329" w:type="dxa"/>
           </w:tcPr>
           <w:p>
             <w:pPr>
@@ -222,7 +300,7 @@
         </w:tc>
         <w:tc>
           <w:tcPr>
-            <w:tcW w:w="3312" w:type="dxa"/>
+            <w:tcW w:w="3329" w:type="dxa"/>
           </w:tcPr>
           <w:p>
             <w:pPr>
@@ -237,12 +315,13 @@
       <w:tr>
         <w:trPr>
           <w:cnfStyle w:val="000000100000" w:firstRow="0" w:lastRow="0" w:firstColumn="0" w:lastColumn="0" w:oddVBand="0" w:evenVBand="0" w:oddHBand="1" w:evenHBand="0" w:firstRowFirstColumn="0" w:firstRowLastColumn="0" w:lastRowFirstColumn="0" w:lastRowLastColumn="0"/>
+          <w:trHeight w:val="1282"/>
           <w:jc w:val="center"/>
         </w:trPr>
         <w:tc>
           <w:tcPr>
             <w:cnfStyle w:val="001000000000" w:firstRow="0" w:lastRow="0" w:firstColumn="1" w:lastColumn="0" w:oddVBand="0" w:evenVBand="0" w:oddHBand="0" w:evenHBand="0" w:firstRowFirstColumn="0" w:firstRowLastColumn="0" w:lastRowFirstColumn="0" w:lastRowLastColumn="0"/>
-            <w:tcW w:w="3312" w:type="dxa"/>
+            <w:tcW w:w="3329" w:type="dxa"/>
           </w:tcPr>
           <w:p>
             <w:r>
@@ -252,7 +331,7 @@
         </w:tc>
         <w:tc>
           <w:tcPr>
-            <w:tcW w:w="3312" w:type="dxa"/>
+            <w:tcW w:w="3329" w:type="dxa"/>
           </w:tcPr>
           <w:p>
             <w:pPr>
@@ -265,7 +344,7 @@
         </w:tc>
         <w:tc>
           <w:tcPr>
-            <w:tcW w:w="3312" w:type="dxa"/>
+            <w:tcW w:w="3329" w:type="dxa"/>
           </w:tcPr>
           <w:p>
             <w:pPr>
@@ -279,12 +358,13 @@
       </w:tr>
       <w:tr>
         <w:trPr>
+          <w:trHeight w:val="1316"/>
           <w:jc w:val="center"/>
         </w:trPr>
         <w:tc>
           <w:tcPr>
             <w:cnfStyle w:val="001000000000" w:firstRow="0" w:lastRow="0" w:firstColumn="1" w:lastColumn="0" w:oddVBand="0" w:evenVBand="0" w:oddHBand="0" w:evenHBand="0" w:firstRowFirstColumn="0" w:firstRowLastColumn="0" w:lastRowFirstColumn="0" w:lastRowLastColumn="0"/>
-            <w:tcW w:w="3312" w:type="dxa"/>
+            <w:tcW w:w="3329" w:type="dxa"/>
           </w:tcPr>
           <w:p>
             <w:r>
@@ -294,7 +374,7 @@
         </w:tc>
         <w:tc>
           <w:tcPr>
-            <w:tcW w:w="3312" w:type="dxa"/>
+            <w:tcW w:w="3329" w:type="dxa"/>
           </w:tcPr>
           <w:p>
             <w:pPr>
@@ -307,7 +387,7 @@
         </w:tc>
         <w:tc>
           <w:tcPr>
-            <w:tcW w:w="3312" w:type="dxa"/>
+            <w:tcW w:w="3329" w:type="dxa"/>
           </w:tcPr>
           <w:p>
             <w:pPr>
@@ -322,12 +402,13 @@
       <w:tr>
         <w:trPr>
           <w:cnfStyle w:val="000000100000" w:firstRow="0" w:lastRow="0" w:firstColumn="0" w:lastColumn="0" w:oddVBand="0" w:evenVBand="0" w:oddHBand="1" w:evenHBand="0" w:firstRowFirstColumn="0" w:firstRowLastColumn="0" w:lastRowFirstColumn="0" w:lastRowLastColumn="0"/>
+          <w:trHeight w:val="1282"/>
           <w:jc w:val="center"/>
         </w:trPr>
         <w:tc>
           <w:tcPr>
             <w:cnfStyle w:val="001000000000" w:firstRow="0" w:lastRow="0" w:firstColumn="1" w:lastColumn="0" w:oddVBand="0" w:evenVBand="0" w:oddHBand="0" w:evenHBand="0" w:firstRowFirstColumn="0" w:firstRowLastColumn="0" w:lastRowFirstColumn="0" w:lastRowLastColumn="0"/>
-            <w:tcW w:w="3312" w:type="dxa"/>
+            <w:tcW w:w="3329" w:type="dxa"/>
           </w:tcPr>
           <w:p>
             <w:r>
@@ -337,7 +418,7 @@
         </w:tc>
         <w:tc>
           <w:tcPr>
-            <w:tcW w:w="3312" w:type="dxa"/>
+            <w:tcW w:w="3329" w:type="dxa"/>
           </w:tcPr>
           <w:p>
             <w:pPr>
@@ -350,7 +431,7 @@
         </w:tc>
         <w:tc>
           <w:tcPr>
-            <w:tcW w:w="3312" w:type="dxa"/>
+            <w:tcW w:w="3329" w:type="dxa"/>
           </w:tcPr>
           <w:p>
             <w:pPr>
@@ -364,12 +445,13 @@
       </w:tr>
       <w:tr>
         <w:trPr>
+          <w:trHeight w:val="1316"/>
           <w:jc w:val="center"/>
         </w:trPr>
         <w:tc>
           <w:tcPr>
             <w:cnfStyle w:val="001000000000" w:firstRow="0" w:lastRow="0" w:firstColumn="1" w:lastColumn="0" w:oddVBand="0" w:evenVBand="0" w:oddHBand="0" w:evenHBand="0" w:firstRowFirstColumn="0" w:firstRowLastColumn="0" w:lastRowFirstColumn="0" w:lastRowLastColumn="0"/>
-            <w:tcW w:w="3312" w:type="dxa"/>
+            <w:tcW w:w="3329" w:type="dxa"/>
           </w:tcPr>
           <w:p>
             <w:r>
@@ -379,7 +461,7 @@
         </w:tc>
         <w:tc>
           <w:tcPr>
-            <w:tcW w:w="3312" w:type="dxa"/>
+            <w:tcW w:w="3329" w:type="dxa"/>
           </w:tcPr>
           <w:p>
             <w:pPr>
@@ -392,7 +474,7 @@
         </w:tc>
         <w:tc>
           <w:tcPr>
-            <w:tcW w:w="3312" w:type="dxa"/>
+            <w:tcW w:w="3329" w:type="dxa"/>
           </w:tcPr>
           <w:p>
             <w:pPr>
@@ -407,12 +489,13 @@
       <w:tr>
         <w:trPr>
           <w:cnfStyle w:val="000000100000" w:firstRow="0" w:lastRow="0" w:firstColumn="0" w:lastColumn="0" w:oddVBand="0" w:evenVBand="0" w:oddHBand="1" w:evenHBand="0" w:firstRowFirstColumn="0" w:firstRowLastColumn="0" w:lastRowFirstColumn="0" w:lastRowLastColumn="0"/>
+          <w:trHeight w:val="1282"/>
           <w:jc w:val="center"/>
         </w:trPr>
         <w:tc>
           <w:tcPr>
             <w:cnfStyle w:val="001000000000" w:firstRow="0" w:lastRow="0" w:firstColumn="1" w:lastColumn="0" w:oddVBand="0" w:evenVBand="0" w:oddHBand="0" w:evenHBand="0" w:firstRowFirstColumn="0" w:firstRowLastColumn="0" w:lastRowFirstColumn="0" w:lastRowLastColumn="0"/>
-            <w:tcW w:w="3312" w:type="dxa"/>
+            <w:tcW w:w="3329" w:type="dxa"/>
           </w:tcPr>
           <w:p>
             <w:r>
@@ -422,7 +505,7 @@
         </w:tc>
         <w:tc>
           <w:tcPr>
-            <w:tcW w:w="3312" w:type="dxa"/>
+            <w:tcW w:w="3329" w:type="dxa"/>
           </w:tcPr>
           <w:p>
             <w:pPr>
@@ -435,7 +518,7 @@
         </w:tc>
         <w:tc>
           <w:tcPr>
-            <w:tcW w:w="3312" w:type="dxa"/>
+            <w:tcW w:w="3329" w:type="dxa"/>
           </w:tcPr>
           <w:p>
             <w:pPr>
@@ -449,12 +532,13 @@
       </w:tr>
       <w:tr>
         <w:trPr>
+          <w:trHeight w:val="1316"/>
           <w:jc w:val="center"/>
         </w:trPr>
         <w:tc>
           <w:tcPr>
             <w:cnfStyle w:val="001000000000" w:firstRow="0" w:lastRow="0" w:firstColumn="1" w:lastColumn="0" w:oddVBand="0" w:evenVBand="0" w:oddHBand="0" w:evenHBand="0" w:firstRowFirstColumn="0" w:firstRowLastColumn="0" w:lastRowFirstColumn="0" w:lastRowLastColumn="0"/>
-            <w:tcW w:w="3312" w:type="dxa"/>
+            <w:tcW w:w="3329" w:type="dxa"/>
           </w:tcPr>
           <w:p>
             <w:r>
@@ -464,7 +548,7 @@
         </w:tc>
         <w:tc>
           <w:tcPr>
-            <w:tcW w:w="3312" w:type="dxa"/>
+            <w:tcW w:w="3329" w:type="dxa"/>
           </w:tcPr>
           <w:p>
             <w:pPr>
@@ -477,7 +561,7 @@
         </w:tc>
         <w:tc>
           <w:tcPr>
-            <w:tcW w:w="3312" w:type="dxa"/>
+            <w:tcW w:w="3329" w:type="dxa"/>
           </w:tcPr>
           <w:p>
             <w:pPr>
@@ -492,12 +576,13 @@
       <w:tr>
         <w:trPr>
           <w:cnfStyle w:val="000000100000" w:firstRow="0" w:lastRow="0" w:firstColumn="0" w:lastColumn="0" w:oddVBand="0" w:evenVBand="0" w:oddHBand="1" w:evenHBand="0" w:firstRowFirstColumn="0" w:firstRowLastColumn="0" w:lastRowFirstColumn="0" w:lastRowLastColumn="0"/>
+          <w:trHeight w:val="641"/>
           <w:jc w:val="center"/>
         </w:trPr>
         <w:tc>
           <w:tcPr>
             <w:cnfStyle w:val="001000000000" w:firstRow="0" w:lastRow="0" w:firstColumn="1" w:lastColumn="0" w:oddVBand="0" w:evenVBand="0" w:oddHBand="0" w:evenHBand="0" w:firstRowFirstColumn="0" w:firstRowLastColumn="0" w:lastRowFirstColumn="0" w:lastRowLastColumn="0"/>
-            <w:tcW w:w="3312" w:type="dxa"/>
+            <w:tcW w:w="3329" w:type="dxa"/>
           </w:tcPr>
           <w:p>
             <w:r>
@@ -507,7 +592,7 @@
         </w:tc>
         <w:tc>
           <w:tcPr>
-            <w:tcW w:w="3312" w:type="dxa"/>
+            <w:tcW w:w="3329" w:type="dxa"/>
           </w:tcPr>
           <w:p>
             <w:pPr>
@@ -520,7 +605,7 @@
         </w:tc>
         <w:tc>
           <w:tcPr>
-            <w:tcW w:w="3312" w:type="dxa"/>
+            <w:tcW w:w="3329" w:type="dxa"/>
           </w:tcPr>
           <w:p>
             <w:pPr>
@@ -534,12 +619,13 @@
       </w:tr>
       <w:tr>
         <w:trPr>
+          <w:trHeight w:val="1316"/>
           <w:jc w:val="center"/>
         </w:trPr>
         <w:tc>
           <w:tcPr>
             <w:cnfStyle w:val="001000000000" w:firstRow="0" w:lastRow="0" w:firstColumn="1" w:lastColumn="0" w:oddVBand="0" w:evenVBand="0" w:oddHBand="0" w:evenHBand="0" w:firstRowFirstColumn="0" w:firstRowLastColumn="0" w:lastRowFirstColumn="0" w:lastRowLastColumn="0"/>
-            <w:tcW w:w="3312" w:type="dxa"/>
+            <w:tcW w:w="3329" w:type="dxa"/>
           </w:tcPr>
           <w:p>
             <w:r>
@@ -549,7 +635,7 @@
         </w:tc>
         <w:tc>
           <w:tcPr>
-            <w:tcW w:w="3312" w:type="dxa"/>
+            <w:tcW w:w="3329" w:type="dxa"/>
           </w:tcPr>
           <w:p>
             <w:pPr>
@@ -562,7 +648,7 @@
         </w:tc>
         <w:tc>
           <w:tcPr>
-            <w:tcW w:w="3312" w:type="dxa"/>
+            <w:tcW w:w="3329" w:type="dxa"/>
           </w:tcPr>
           <w:p>
             <w:pPr>
@@ -577,12 +663,13 @@
       <w:tr>
         <w:trPr>
           <w:cnfStyle w:val="000000100000" w:firstRow="0" w:lastRow="0" w:firstColumn="0" w:lastColumn="0" w:oddVBand="0" w:evenVBand="0" w:oddHBand="1" w:evenHBand="0" w:firstRowFirstColumn="0" w:firstRowLastColumn="0" w:lastRowFirstColumn="0" w:lastRowLastColumn="0"/>
+          <w:trHeight w:val="641"/>
           <w:jc w:val="center"/>
         </w:trPr>
         <w:tc>
           <w:tcPr>
             <w:cnfStyle w:val="001000000000" w:firstRow="0" w:lastRow="0" w:firstColumn="1" w:lastColumn="0" w:oddVBand="0" w:evenVBand="0" w:oddHBand="0" w:evenHBand="0" w:firstRowFirstColumn="0" w:firstRowLastColumn="0" w:lastRowFirstColumn="0" w:lastRowLastColumn="0"/>
-            <w:tcW w:w="3312" w:type="dxa"/>
+            <w:tcW w:w="3329" w:type="dxa"/>
           </w:tcPr>
           <w:p>
             <w:r>
@@ -592,7 +679,7 @@
         </w:tc>
         <w:tc>
           <w:tcPr>
-            <w:tcW w:w="3312" w:type="dxa"/>
+            <w:tcW w:w="3329" w:type="dxa"/>
           </w:tcPr>
           <w:p>
             <w:pPr>
@@ -605,7 +692,7 @@
         </w:tc>
         <w:tc>
           <w:tcPr>
-            <w:tcW w:w="3312" w:type="dxa"/>
+            <w:tcW w:w="3329" w:type="dxa"/>
           </w:tcPr>
           <w:p>
             <w:pPr>
@@ -619,23 +706,23 @@
       </w:tr>
       <w:tr>
         <w:trPr>
+          <w:trHeight w:val="1957"/>
           <w:jc w:val="center"/>
         </w:trPr>
         <w:tc>
           <w:tcPr>
             <w:cnfStyle w:val="001000000000" w:firstRow="0" w:lastRow="0" w:firstColumn="1" w:lastColumn="0" w:oddVBand="0" w:evenVBand="0" w:oddHBand="0" w:evenHBand="0" w:firstRowFirstColumn="0" w:firstRowLastColumn="0" w:lastRowFirstColumn="0" w:lastRowLastColumn="0"/>
-            <w:tcW w:w="3312" w:type="dxa"/>
+            <w:tcW w:w="3329" w:type="dxa"/>
           </w:tcPr>
           <w:p>
             <w:r>
-              <w:lastRenderedPageBreak/>
               <w:t>Audit on actual USB media</w:t>
             </w:r>
           </w:p>
         </w:tc>
         <w:tc>
           <w:tcPr>
-            <w:tcW w:w="3312" w:type="dxa"/>
+            <w:tcW w:w="3329" w:type="dxa"/>
           </w:tcPr>
           <w:p>
             <w:pPr>
@@ -648,7 +735,7 @@
         </w:tc>
         <w:tc>
           <w:tcPr>
-            <w:tcW w:w="3312" w:type="dxa"/>
+            <w:tcW w:w="3329" w:type="dxa"/>
           </w:tcPr>
           <w:p>
             <w:pPr>
@@ -666,13 +753,19 @@
         <w:pStyle w:val="Heading1"/>
       </w:pPr>
       <w:r>
+        <w:lastRenderedPageBreak/>
         <w:t>5. Evidence and Observations</w:t>
       </w:r>
     </w:p>
     <w:p>
       <w:r>
-        <w:t>USB log: logs/usb_events.jsonl</w:t>
+        <w:t>USB log: logs/</w:t>
       </w:r>
+      <w:proofErr w:type="spellStart"/>
+      <w:r>
+        <w:t>usb_events.jsonl</w:t>
+      </w:r>
+      <w:proofErr w:type="spellEnd"/>
     </w:p>
     <w:p>
       <w:r>
@@ -681,14 +774,267 @@
     </w:p>
     <w:p>
       <w:r>
-        <w:t>File audit log: logs/file_audit_test.jsonl</w:t>
+        <w:rPr>
+          <w:noProof/>
+        </w:rPr>
+        <w:drawing>
+          <wp:anchor distT="0" distB="0" distL="114300" distR="114300" simplePos="0" relativeHeight="251658240" behindDoc="0" locked="0" layoutInCell="1" allowOverlap="1" wp14:anchorId="62DA2EB0" wp14:editId="5C799C2D">
+            <wp:simplePos x="0" y="0"/>
+            <wp:positionH relativeFrom="margin">
+              <wp:align>right</wp:align>
+            </wp:positionH>
+            <wp:positionV relativeFrom="page">
+              <wp:posOffset>2108200</wp:posOffset>
+            </wp:positionV>
+            <wp:extent cx="6309360" cy="3429000"/>
+            <wp:effectExtent l="0" t="0" r="0" b="0"/>
+            <wp:wrapTopAndBottom/>
+            <wp:docPr id="215299905" name="Picture 1"/>
+            <wp:cNvGraphicFramePr>
+              <a:graphicFrameLocks xmlns:a="http://schemas.openxmlformats.org/drawingml/2006/main" noChangeAspect="1"/>
+            </wp:cNvGraphicFramePr>
+            <a:graphic xmlns:a="http://schemas.openxmlformats.org/drawingml/2006/main">
+              <a:graphicData uri="http://schemas.openxmlformats.org/drawingml/2006/picture">
+                <pic:pic xmlns:pic="http://schemas.openxmlformats.org/drawingml/2006/picture">
+                  <pic:nvPicPr>
+                    <pic:cNvPr id="0" name="Picture 1"/>
+                    <pic:cNvPicPr>
+                      <a:picLocks noChangeAspect="1" noChangeArrowheads="1"/>
+                    </pic:cNvPicPr>
+                  </pic:nvPicPr>
+                  <pic:blipFill>
+                    <a:blip r:embed="rId9">
+                      <a:extLst>
+                        <a:ext uri="{28A0092B-C50C-407E-A947-70E740481C1C}">
+                          <a14:useLocalDpi xmlns:a14="http://schemas.microsoft.com/office/drawing/2010/main" val="0"/>
+                        </a:ext>
+                      </a:extLst>
+                    </a:blip>
+                    <a:srcRect/>
+                    <a:stretch>
+                      <a:fillRect/>
+                    </a:stretch>
+                  </pic:blipFill>
+                  <pic:spPr bwMode="auto">
+                    <a:xfrm>
+                      <a:off x="0" y="0"/>
+                      <a:ext cx="6315909" cy="3432559"/>
+                    </a:xfrm>
+                    <a:prstGeom prst="rect">
+                      <a:avLst/>
+                    </a:prstGeom>
+                    <a:noFill/>
+                    <a:ln>
+                      <a:noFill/>
+                    </a:ln>
+                  </pic:spPr>
+                </pic:pic>
+              </a:graphicData>
+            </a:graphic>
+            <wp14:sizeRelV relativeFrom="margin">
+              <wp14:pctHeight>0</wp14:pctHeight>
+            </wp14:sizeRelV>
+          </wp:anchor>
+        </w:drawing>
+      </w:r>
+      <w:r>
+        <w:drawing>
+          <wp:anchor distT="0" distB="0" distL="114300" distR="114300" simplePos="0" relativeHeight="251659264" behindDoc="0" locked="0" layoutInCell="1" allowOverlap="1" wp14:anchorId="7A2A5B5D" wp14:editId="063367E2">
+            <wp:simplePos x="0" y="0"/>
+            <wp:positionH relativeFrom="margin">
+              <wp:align>left</wp:align>
+            </wp:positionH>
+            <wp:positionV relativeFrom="margin">
+              <wp:posOffset>5269230</wp:posOffset>
+            </wp:positionV>
+            <wp:extent cx="6309360" cy="3504565"/>
+            <wp:effectExtent l="0" t="0" r="0" b="635"/>
+            <wp:wrapTopAndBottom/>
+            <wp:docPr id="1746372443" name="Picture 3"/>
+            <wp:cNvGraphicFramePr>
+              <a:graphicFrameLocks xmlns:a="http://schemas.openxmlformats.org/drawingml/2006/main" noChangeAspect="1"/>
+            </wp:cNvGraphicFramePr>
+            <a:graphic xmlns:a="http://schemas.openxmlformats.org/drawingml/2006/main">
+              <a:graphicData uri="http://schemas.openxmlformats.org/drawingml/2006/picture">
+                <pic:pic xmlns:pic="http://schemas.openxmlformats.org/drawingml/2006/picture">
+                  <pic:nvPicPr>
+                    <pic:cNvPr id="0" name="Picture 7"/>
+                    <pic:cNvPicPr>
+                      <a:picLocks noChangeAspect="1" noChangeArrowheads="1"/>
+                    </pic:cNvPicPr>
+                  </pic:nvPicPr>
+                  <pic:blipFill>
+                    <a:blip r:embed="rId10">
+                      <a:extLst>
+                        <a:ext uri="{28A0092B-C50C-407E-A947-70E740481C1C}">
+                          <a14:useLocalDpi xmlns:a14="http://schemas.microsoft.com/office/drawing/2010/main" val="0"/>
+                        </a:ext>
+                      </a:extLst>
+                    </a:blip>
+                    <a:srcRect/>
+                    <a:stretch>
+                      <a:fillRect/>
+                    </a:stretch>
+                  </pic:blipFill>
+                  <pic:spPr bwMode="auto">
+                    <a:xfrm>
+                      <a:off x="0" y="0"/>
+                      <a:ext cx="6309360" cy="3504565"/>
+                    </a:xfrm>
+                    <a:prstGeom prst="rect">
+                      <a:avLst/>
+                    </a:prstGeom>
+                    <a:noFill/>
+                    <a:ln>
+                      <a:noFill/>
+                    </a:ln>
+                  </pic:spPr>
+                </pic:pic>
+              </a:graphicData>
+            </a:graphic>
+            <wp14:sizeRelV relativeFrom="margin">
+              <wp14:pctHeight>0</wp14:pctHeight>
+            </wp14:sizeRelV>
+          </wp:anchor>
+        </w:drawing>
+      </w:r>
+      <w:r>
+        <w:t>File audit log: logs/</w:t>
+      </w:r>
+      <w:proofErr w:type="spellStart"/>
+      <w:r>
+        <w:t>file_audit_test.jsonl</w:t>
+      </w:r>
+      <w:proofErr w:type="spellEnd"/>
+    </w:p>
+    <w:p>
+      <w:r>
+        <w:lastRenderedPageBreak/>
+        <w:drawing>
+          <wp:anchor distT="0" distB="0" distL="114300" distR="114300" simplePos="0" relativeHeight="251661312" behindDoc="0" locked="0" layoutInCell="1" allowOverlap="1" wp14:anchorId="22629CA4" wp14:editId="1849ED24">
+            <wp:simplePos x="0" y="0"/>
+            <wp:positionH relativeFrom="margin">
+              <wp:align>left</wp:align>
+            </wp:positionH>
+            <wp:positionV relativeFrom="page">
+              <wp:posOffset>4122843</wp:posOffset>
+            </wp:positionV>
+            <wp:extent cx="6309360" cy="3239135"/>
+            <wp:effectExtent l="0" t="0" r="0" b="0"/>
+            <wp:wrapTopAndBottom/>
+            <wp:docPr id="40609535" name="Picture 6"/>
+            <wp:cNvGraphicFramePr>
+              <a:graphicFrameLocks xmlns:a="http://schemas.openxmlformats.org/drawingml/2006/main" noChangeAspect="1"/>
+            </wp:cNvGraphicFramePr>
+            <a:graphic xmlns:a="http://schemas.openxmlformats.org/drawingml/2006/main">
+              <a:graphicData uri="http://schemas.openxmlformats.org/drawingml/2006/picture">
+                <pic:pic xmlns:pic="http://schemas.openxmlformats.org/drawingml/2006/picture">
+                  <pic:nvPicPr>
+                    <pic:cNvPr id="0" name="Picture 15"/>
+                    <pic:cNvPicPr>
+                      <a:picLocks noChangeAspect="1" noChangeArrowheads="1"/>
+                    </pic:cNvPicPr>
+                  </pic:nvPicPr>
+                  <pic:blipFill>
+                    <a:blip r:embed="rId11">
+                      <a:extLst>
+                        <a:ext uri="{28A0092B-C50C-407E-A947-70E740481C1C}">
+                          <a14:useLocalDpi xmlns:a14="http://schemas.microsoft.com/office/drawing/2010/main" val="0"/>
+                        </a:ext>
+                      </a:extLst>
+                    </a:blip>
+                    <a:srcRect/>
+                    <a:stretch>
+                      <a:fillRect/>
+                    </a:stretch>
+                  </pic:blipFill>
+                  <pic:spPr bwMode="auto">
+                    <a:xfrm>
+                      <a:off x="0" y="0"/>
+                      <a:ext cx="6309360" cy="3239135"/>
+                    </a:xfrm>
+                    <a:prstGeom prst="rect">
+                      <a:avLst/>
+                    </a:prstGeom>
+                    <a:noFill/>
+                    <a:ln>
+                      <a:noFill/>
+                    </a:ln>
+                  </pic:spPr>
+                </pic:pic>
+              </a:graphicData>
+            </a:graphic>
+          </wp:anchor>
+        </w:drawing>
       </w:r>
     </w:p>
     <w:p>
       <w:r>
+        <w:rPr>
+          <w:noProof/>
+        </w:rPr>
+        <w:drawing>
+          <wp:anchor distT="0" distB="0" distL="114300" distR="114300" simplePos="0" relativeHeight="251660288" behindDoc="0" locked="0" layoutInCell="1" allowOverlap="1" wp14:anchorId="43D31F43" wp14:editId="1A4B6873">
+            <wp:simplePos x="0" y="0"/>
+            <wp:positionH relativeFrom="column">
+              <wp:posOffset>-3387</wp:posOffset>
+            </wp:positionH>
+            <wp:positionV relativeFrom="page">
+              <wp:posOffset>643467</wp:posOffset>
+            </wp:positionV>
+            <wp:extent cx="6309360" cy="3324860"/>
+            <wp:effectExtent l="0" t="0" r="0" b="8890"/>
+            <wp:wrapTopAndBottom/>
+            <wp:docPr id="274075059" name="Picture 4"/>
+            <wp:cNvGraphicFramePr>
+              <a:graphicFrameLocks xmlns:a="http://schemas.openxmlformats.org/drawingml/2006/main" noChangeAspect="1"/>
+            </wp:cNvGraphicFramePr>
+            <a:graphic xmlns:a="http://schemas.openxmlformats.org/drawingml/2006/main">
+              <a:graphicData uri="http://schemas.openxmlformats.org/drawingml/2006/picture">
+                <pic:pic xmlns:pic="http://schemas.openxmlformats.org/drawingml/2006/picture">
+                  <pic:nvPicPr>
+                    <pic:cNvPr id="0" name="Picture 9"/>
+                    <pic:cNvPicPr>
+                      <a:picLocks noChangeAspect="1" noChangeArrowheads="1"/>
+                    </pic:cNvPicPr>
+                  </pic:nvPicPr>
+                  <pic:blipFill>
+                    <a:blip r:embed="rId12">
+                      <a:extLst>
+                        <a:ext uri="{28A0092B-C50C-407E-A947-70E740481C1C}">
+                          <a14:useLocalDpi xmlns:a14="http://schemas.microsoft.com/office/drawing/2010/main" val="0"/>
+                        </a:ext>
+                      </a:extLst>
+                    </a:blip>
+                    <a:srcRect/>
+                    <a:stretch>
+                      <a:fillRect/>
+                    </a:stretch>
+                  </pic:blipFill>
+                  <pic:spPr bwMode="auto">
+                    <a:xfrm>
+                      <a:off x="0" y="0"/>
+                      <a:ext cx="6309360" cy="3324860"/>
+                    </a:xfrm>
+                    <a:prstGeom prst="rect">
+                      <a:avLst/>
+                    </a:prstGeom>
+                    <a:noFill/>
+                    <a:ln>
+                      <a:noFill/>
+                    </a:ln>
+                  </pic:spPr>
+                </pic:pic>
+              </a:graphicData>
+            </a:graphic>
+          </wp:anchor>
+        </w:drawing>
+      </w:r>
+      <w:r>
         <w:t>The temporary local-folder test recorded FILE_CREATED, FILE_MODIFIED, and FILE_DELETED events. SHA-256 values were present for accessible file contents.</w:t>
       </w:r>
     </w:p>
+    <w:p/>
     <w:p>
       <w:pPr>
         <w:pStyle w:val="Heading1"/>
@@ -726,6 +1072,7 @@
         <w:pStyle w:val="ListBullet"/>
       </w:pPr>
       <w:r>
+        <w:lastRenderedPageBreak/>
         <w:t>Automatic blocking was deliberately disabled and was not validated.</w:t>
       </w:r>
     </w:p>
@@ -805,9 +1152,54 @@
       <w:r>
         <w:t>Do not claim actual USB-volume auditing or device blocking passed unless separately tested.</w:t>
       </w:r>
+      <w:r>
+        <w:drawing>
+          <wp:anchor distT="0" distB="0" distL="114300" distR="114300" simplePos="0" relativeHeight="251663360" behindDoc="0" locked="0" layoutInCell="1" allowOverlap="1" wp14:anchorId="0EE9B5AC" wp14:editId="4146C617">
+            <wp:simplePos x="0" y="0"/>
+            <wp:positionH relativeFrom="margin">
+              <wp:align>left</wp:align>
+            </wp:positionH>
+            <wp:positionV relativeFrom="page">
+              <wp:posOffset>4343188</wp:posOffset>
+            </wp:positionV>
+            <wp:extent cx="6309360" cy="3119120"/>
+            <wp:effectExtent l="0" t="0" r="0" b="5080"/>
+            <wp:wrapTopAndBottom/>
+            <wp:docPr id="45825519" name="Picture 1"/>
+            <wp:cNvGraphicFramePr>
+              <a:graphicFrameLocks xmlns:a="http://schemas.openxmlformats.org/drawingml/2006/main" noChangeAspect="1"/>
+            </wp:cNvGraphicFramePr>
+            <a:graphic xmlns:a="http://schemas.openxmlformats.org/drawingml/2006/main">
+              <a:graphicData uri="http://schemas.openxmlformats.org/drawingml/2006/picture">
+                <pic:pic xmlns:pic="http://schemas.openxmlformats.org/drawingml/2006/picture">
+                  <pic:nvPicPr>
+                    <pic:cNvPr id="45825519" name=""/>
+                    <pic:cNvPicPr/>
+                  </pic:nvPicPr>
+                  <pic:blipFill>
+                    <a:blip r:embed="rId13"/>
+                    <a:stretch>
+                      <a:fillRect/>
+                    </a:stretch>
+                  </pic:blipFill>
+                  <pic:spPr>
+                    <a:xfrm>
+                      <a:off x="0" y="0"/>
+                      <a:ext cx="6309360" cy="3119120"/>
+                    </a:xfrm>
+                    <a:prstGeom prst="rect">
+                      <a:avLst/>
+                    </a:prstGeom>
+                  </pic:spPr>
+                </pic:pic>
+              </a:graphicData>
+            </a:graphic>
+          </wp:anchor>
+        </w:drawing>
+      </w:r>
     </w:p>
     <w:sectPr>
-      <w:footerReference w:type="default" r:id="rId8"/>
+      <w:footerReference w:type="default" r:id="rId14"/>
       <w:pgSz w:w="12240" w:h="15840"/>
       <w:pgMar w:top="1008" w:right="1152" w:bottom="1008" w:left="1152" w:header="720" w:footer="720" w:gutter="0"/>
       <w:cols w:space="720"/>
@@ -1036,7 +1428,7 @@
   <w:abstractNum w:abstractNumId="8" w15:restartNumberingAfterBreak="0">
     <w:nsid w:val="FFFFFF89"/>
     <w:multiLevelType w:val="singleLevel"/>
-    <w:tmpl w:val="29761A62"/>
+    <w:tmpl w:val="62F260B4"/>
     <w:lvl w:ilvl="0">
       <w:start w:val="1"/>
       <w:numFmt w:val="bullet"/>
@@ -1689,7 +2081,6 @@
   <w:style w:type="character" w:default="1" w:styleId="DefaultParagraphFont">
     <w:name w:val="Default Paragraph Font"/>
     <w:uiPriority w:val="1"/>
-    <w:semiHidden/>
     <w:unhideWhenUsed/>
   </w:style>
   <w:style w:type="table" w:default="1" w:styleId="TableNormal">
@@ -12465,6 +12856,23 @@
         <w:shd w:val="clear" w:color="auto" w:fill="FBCAA2" w:themeFill="accent6" w:themeFillTint="7F"/>
       </w:tcPr>
     </w:tblStylePr>
+  </w:style>
+  <w:style w:type="paragraph" w:styleId="NormalWeb">
+    <w:name w:val="Normal (Web)"/>
+    <w:basedOn w:val="Normal"/>
+    <w:uiPriority w:val="99"/>
+    <w:semiHidden/>
+    <w:unhideWhenUsed/>
+    <w:rsid w:val="00EF7E0E"/>
+    <w:pPr>
+      <w:spacing w:before="100" w:beforeAutospacing="1" w:after="100" w:afterAutospacing="1" w:line="240" w:lineRule="auto"/>
+    </w:pPr>
+    <w:rPr>
+      <w:rFonts w:ascii="Times New Roman" w:eastAsia="Times New Roman" w:hAnsi="Times New Roman" w:cs="Times New Roman"/>
+      <w:sz w:val="24"/>
+      <w:szCs w:val="24"/>
+      <w:lang w:bidi="hi-IN"/>
+    </w:rPr>
   </w:style>
 </w:styles>
 </file>

</xml_diff>